<commit_message>
Batch 19 — v2.1 classifier-corrected panel rerun (v1.0.0-rc3): manuscript/supplement/real_v21/Table_S4_wild_bootstrap.docx
</commit_message>
<xml_diff>
--- a/manuscript/supplement/real_v21/Table_S4_wild_bootstrap.docx
+++ b/manuscript/supplement/real_v21/Table_S4_wild_bootstrap.docx
@@ -534,7 +534,7 @@
                 <w:rFonts w:ascii="Arial" w:hAnsi="Arial"/>
                 <w:sz w:val="20"/>
               </w:rPr>
-              <w:t>+15.218</w:t>
+              <w:t>+15.108</w:t>
             </w:r>
           </w:p>
         </w:tc>
@@ -548,7 +548,7 @@
                 <w:rFonts w:ascii="Arial" w:hAnsi="Arial"/>
                 <w:sz w:val="20"/>
               </w:rPr>
-              <w:t>0.878</w:t>
+              <w:t>0.873</w:t>
             </w:r>
           </w:p>
         </w:tc>
@@ -648,7 +648,7 @@
                 <w:rFonts w:ascii="Arial" w:hAnsi="Arial"/>
                 <w:sz w:val="20"/>
               </w:rPr>
-              <w:t>-3.623</w:t>
+              <w:t>-3.677</w:t>
             </w:r>
           </w:p>
         </w:tc>
@@ -662,7 +662,7 @@
                 <w:rFonts w:ascii="Arial" w:hAnsi="Arial"/>
                 <w:sz w:val="20"/>
               </w:rPr>
-              <w:t>-1.253</w:t>
+              <w:t>-1.269</w:t>
             </w:r>
           </w:p>
         </w:tc>
@@ -762,7 +762,7 @@
                 <w:rFonts w:ascii="Arial" w:hAnsi="Arial"/>
                 <w:sz w:val="20"/>
               </w:rPr>
-              <w:t>-0.098</w:t>
+              <w:t>-0.239</w:t>
             </w:r>
           </w:p>
         </w:tc>
@@ -776,7 +776,7 @@
                 <w:rFonts w:ascii="Arial" w:hAnsi="Arial"/>
                 <w:sz w:val="20"/>
               </w:rPr>
-              <w:t>-1.589</w:t>
+              <w:t>-1.411</w:t>
             </w:r>
           </w:p>
         </w:tc>
@@ -804,7 +804,7 @@
                 <w:rFonts w:ascii="Arial" w:hAnsi="Arial"/>
                 <w:sz w:val="20"/>
               </w:rPr>
-              <w:t>0.1570</w:t>
+              <w:t>0.2035</w:t>
             </w:r>
           </w:p>
         </w:tc>

</xml_diff>